<commit_message>
Refine vocabulary examples and activity progression
</commit_message>
<xml_diff>
--- a/plans/6th Grade Technology/Study Guides/6th grade - IIIT - Week 7 - Study Guide - microbit Parts and Input-Output Check.docx
+++ b/plans/6th Grade Technology/Study Guides/6th grade - IIIT - Week 7 - Study Guide - microbit Parts and Input-Output Check.docx
@@ -8,8 +8,10 @@
       </w:pPr>
       <w:r>
         <w:rPr>
+          <w:rFonts w:ascii="Arial" w:hAnsi="Arial" w:cs="Arial"/>
           <w:b/>
-          <w:sz w:val="22"/>
+          <w:sz w:val="24"/>
+          <w:szCs w:val="24"/>
         </w:rPr>
         <w:t>Academia Internacional David</w:t>
         <w:br/>
@@ -22,8 +24,10 @@
       </w:pPr>
       <w:r>
         <w:rPr>
+          <w:rFonts w:ascii="Arial" w:hAnsi="Arial" w:cs="Arial"/>
           <w:b/>
-          <w:sz w:val="32"/>
+          <w:sz w:val="24"/>
+          <w:szCs w:val="24"/>
         </w:rPr>
         <w:t>Study Guide: micro:bit Parts and Input/Output Check</w:t>
       </w:r>
@@ -33,7 +37,12 @@
         <w:jc w:val="center"/>
       </w:pPr>
       <w:r>
-        <w:t>6th Grade - IIIT - Week 7 - Summative 4</w:t>
+        <w:rPr>
+          <w:rFonts w:ascii="Arial" w:hAnsi="Arial" w:cs="Arial"/>
+          <w:sz w:val="24"/>
+          <w:szCs w:val="24"/>
+        </w:rPr>
+        <w:t xml:space="preserve">6th Grade - IIIT - Week 7 - Summative 5</w:t>
       </w:r>
     </w:p>
     <w:p>
@@ -42,6 +51,11 @@
         <w:spacing w:before="140" w:after="40"/>
       </w:pPr>
       <w:r>
+        <w:rPr>
+          <w:rFonts w:ascii="Arial" w:hAnsi="Arial" w:cs="Arial"/>
+          <w:sz w:val="24"/>
+          <w:szCs w:val="24"/>
+        </w:rPr>
         <w:t>What To Know</w:t>
       </w:r>
     </w:p>
@@ -51,6 +65,11 @@
         <w:ind w:left="259" w:hanging="259"/>
       </w:pPr>
       <w:r>
+        <w:rPr>
+          <w:rFonts w:ascii="Arial" w:hAnsi="Arial" w:cs="Arial"/>
+          <w:sz w:val="24"/>
+          <w:szCs w:val="24"/>
+        </w:rPr>
         <w:t>- Important micro:bit parts: LED display, buttons, USB port, battery connector.</w:t>
       </w:r>
     </w:p>
@@ -60,6 +79,11 @@
         <w:ind w:left="259" w:hanging="259"/>
       </w:pPr>
       <w:r>
+        <w:rPr>
+          <w:rFonts w:ascii="Arial" w:hAnsi="Arial" w:cs="Arial"/>
+          <w:sz w:val="24"/>
+          <w:szCs w:val="24"/>
+        </w:rPr>
         <w:t>- The difference between input and output.</w:t>
       </w:r>
     </w:p>
@@ -69,6 +93,11 @@
         <w:ind w:left="259" w:hanging="259"/>
       </w:pPr>
       <w:r>
+        <w:rPr>
+          <w:rFonts w:ascii="Arial" w:hAnsi="Arial" w:cs="Arial"/>
+          <w:sz w:val="24"/>
+          <w:szCs w:val="24"/>
+        </w:rPr>
         <w:t>- Which actions give information to the micro:bit and which actions show a response.</w:t>
       </w:r>
     </w:p>
@@ -78,6 +107,11 @@
         <w:ind w:left="259" w:hanging="259"/>
       </w:pPr>
       <w:r>
+        <w:rPr>
+          <w:rFonts w:ascii="Arial" w:hAnsi="Arial" w:cs="Arial"/>
+          <w:sz w:val="24"/>
+          <w:szCs w:val="24"/>
+        </w:rPr>
         <w:t>- How variables can change in a simple counter program.</w:t>
       </w:r>
     </w:p>
@@ -87,6 +121,11 @@
         <w:spacing w:before="140" w:after="40"/>
       </w:pPr>
       <w:r>
+        <w:rPr>
+          <w:rFonts w:ascii="Arial" w:hAnsi="Arial" w:cs="Arial"/>
+          <w:sz w:val="24"/>
+          <w:szCs w:val="24"/>
+        </w:rPr>
         <w:t>Key Vocabulary</w:t>
       </w:r>
     </w:p>
@@ -110,7 +149,10 @@
           <w:p>
             <w:r>
               <w:rPr>
+                <w:rFonts w:ascii="Arial" w:hAnsi="Arial" w:cs="Arial"/>
                 <w:b/>
+                <w:sz w:val="24"/>
+                <w:szCs w:val="24"/>
               </w:rPr>
               <w:t>Term</w:t>
             </w:r>
@@ -124,7 +166,10 @@
           <w:p>
             <w:r>
               <w:rPr>
+                <w:rFonts w:ascii="Arial" w:hAnsi="Arial" w:cs="Arial"/>
                 <w:b/>
+                <w:sz w:val="24"/>
+                <w:szCs w:val="24"/>
               </w:rPr>
               <w:t>What I should remember</w:t>
             </w:r>
@@ -139,6 +184,11 @@
           </w:tcPr>
           <w:p>
             <w:r>
+              <w:rPr>
+                <w:rFonts w:ascii="Arial" w:hAnsi="Arial" w:cs="Arial"/>
+                <w:sz w:val="24"/>
+                <w:szCs w:val="24"/>
+              </w:rPr>
               <w:t>input</w:t>
             </w:r>
           </w:p>
@@ -161,6 +211,11 @@
           </w:tcPr>
           <w:p>
             <w:r>
+              <w:rPr>
+                <w:rFonts w:ascii="Arial" w:hAnsi="Arial" w:cs="Arial"/>
+                <w:sz w:val="24"/>
+                <w:szCs w:val="24"/>
+              </w:rPr>
               <w:t>output</w:t>
             </w:r>
           </w:p>
@@ -183,6 +238,11 @@
           </w:tcPr>
           <w:p>
             <w:r>
+              <w:rPr>
+                <w:rFonts w:ascii="Arial" w:hAnsi="Arial" w:cs="Arial"/>
+                <w:sz w:val="24"/>
+                <w:szCs w:val="24"/>
+              </w:rPr>
               <w:t>LED display</w:t>
             </w:r>
           </w:p>
@@ -205,6 +265,11 @@
           </w:tcPr>
           <w:p>
             <w:r>
+              <w:rPr>
+                <w:rFonts w:ascii="Arial" w:hAnsi="Arial" w:cs="Arial"/>
+                <w:sz w:val="24"/>
+                <w:szCs w:val="24"/>
+              </w:rPr>
               <w:t>Button A</w:t>
             </w:r>
           </w:p>
@@ -227,6 +292,11 @@
           </w:tcPr>
           <w:p>
             <w:r>
+              <w:rPr>
+                <w:rFonts w:ascii="Arial" w:hAnsi="Arial" w:cs="Arial"/>
+                <w:sz w:val="24"/>
+                <w:szCs w:val="24"/>
+              </w:rPr>
               <w:t>Button B</w:t>
             </w:r>
           </w:p>
@@ -249,6 +319,11 @@
           </w:tcPr>
           <w:p>
             <w:r>
+              <w:rPr>
+                <w:rFonts w:ascii="Arial" w:hAnsi="Arial" w:cs="Arial"/>
+                <w:sz w:val="24"/>
+                <w:szCs w:val="24"/>
+              </w:rPr>
               <w:t>sensor</w:t>
             </w:r>
           </w:p>
@@ -271,6 +346,11 @@
           </w:tcPr>
           <w:p>
             <w:r>
+              <w:rPr>
+                <w:rFonts w:ascii="Arial" w:hAnsi="Arial" w:cs="Arial"/>
+                <w:sz w:val="24"/>
+                <w:szCs w:val="24"/>
+              </w:rPr>
               <w:t>variable</w:t>
             </w:r>
           </w:p>
@@ -292,11 +372,21 @@
         <w:spacing w:before="140" w:after="40"/>
       </w:pPr>
       <w:r>
+        <w:rPr>
+          <w:rFonts w:ascii="Arial" w:hAnsi="Arial" w:cs="Arial"/>
+          <w:sz w:val="24"/>
+          <w:szCs w:val="24"/>
+        </w:rPr>
         <w:t>Worked Example</w:t>
       </w:r>
     </w:p>
     <w:p>
       <w:r>
+        <w:rPr>
+          <w:rFonts w:ascii="Arial" w:hAnsi="Arial" w:cs="Arial"/>
+          <w:sz w:val="24"/>
+          <w:szCs w:val="24"/>
+        </w:rPr>
         <w:t>If Button A is pressed and the LED display shows a heart, Button A is the input and the heart on the LEDs is the output.</w:t>
       </w:r>
     </w:p>
@@ -306,6 +396,11 @@
         <w:spacing w:before="140" w:after="40"/>
       </w:pPr>
       <w:r>
+        <w:rPr>
+          <w:rFonts w:ascii="Arial" w:hAnsi="Arial" w:cs="Arial"/>
+          <w:sz w:val="24"/>
+          <w:szCs w:val="24"/>
+        </w:rPr>
         <w:t>Practice Before The Assessment</w:t>
       </w:r>
     </w:p>
@@ -315,6 +410,11 @@
         <w:ind w:left="259" w:hanging="259"/>
       </w:pPr>
       <w:r>
+        <w:rPr>
+          <w:rFonts w:ascii="Arial" w:hAnsi="Arial" w:cs="Arial"/>
+          <w:sz w:val="24"/>
+          <w:szCs w:val="24"/>
+        </w:rPr>
         <w:t>- Sort as input/output: shaking the micro:bit, showing a number, pressing Button B.</w:t>
       </w:r>
     </w:p>
@@ -324,6 +424,11 @@
         <w:ind w:left="259" w:hanging="259"/>
       </w:pPr>
       <w:r>
+        <w:rPr>
+          <w:rFonts w:ascii="Arial" w:hAnsi="Arial" w:cs="Arial"/>
+          <w:sz w:val="24"/>
+          <w:szCs w:val="24"/>
+        </w:rPr>
         <w:t>- Name the part used to connect the micro:bit to a computer.</w:t>
       </w:r>
     </w:p>
@@ -333,6 +438,11 @@
         <w:ind w:left="259" w:hanging="259"/>
       </w:pPr>
       <w:r>
+        <w:rPr>
+          <w:rFonts w:ascii="Arial" w:hAnsi="Arial" w:cs="Arial"/>
+          <w:sz w:val="24"/>
+          <w:szCs w:val="24"/>
+        </w:rPr>
         <w:t>- Explain why a project needs both input and output.</w:t>
       </w:r>
     </w:p>
@@ -342,6 +452,11 @@
         <w:spacing w:before="140" w:after="40"/>
       </w:pPr>
       <w:r>
+        <w:rPr>
+          <w:rFonts w:ascii="Arial" w:hAnsi="Arial" w:cs="Arial"/>
+          <w:sz w:val="24"/>
+          <w:szCs w:val="24"/>
+        </w:rPr>
         <w:t>Assessment-Day Checklist</w:t>
       </w:r>
     </w:p>
@@ -351,6 +466,11 @@
         <w:ind w:left="259" w:hanging="259"/>
       </w:pPr>
       <w:r>
+        <w:rPr>
+          <w:rFonts w:ascii="Arial" w:hAnsi="Arial" w:cs="Arial"/>
+          <w:sz w:val="24"/>
+          <w:szCs w:val="24"/>
+        </w:rPr>
         <w:t>- Label parts correctly.</w:t>
       </w:r>
     </w:p>
@@ -360,6 +480,11 @@
         <w:ind w:left="259" w:hanging="259"/>
       </w:pPr>
       <w:r>
+        <w:rPr>
+          <w:rFonts w:ascii="Arial" w:hAnsi="Arial" w:cs="Arial"/>
+          <w:sz w:val="24"/>
+          <w:szCs w:val="24"/>
+        </w:rPr>
         <w:t>- Sort examples carefully.</w:t>
       </w:r>
     </w:p>
@@ -369,6 +494,11 @@
         <w:ind w:left="259" w:hanging="259"/>
       </w:pPr>
       <w:r>
+        <w:rPr>
+          <w:rFonts w:ascii="Arial" w:hAnsi="Arial" w:cs="Arial"/>
+          <w:sz w:val="24"/>
+          <w:szCs w:val="24"/>
+        </w:rPr>
         <w:t>- Use input/output words.</w:t>
       </w:r>
     </w:p>
@@ -378,6 +508,11 @@
         <w:ind w:left="259" w:hanging="259"/>
       </w:pPr>
       <w:r>
+        <w:rPr>
+          <w:rFonts w:ascii="Arial" w:hAnsi="Arial" w:cs="Arial"/>
+          <w:sz w:val="24"/>
+          <w:szCs w:val="24"/>
+        </w:rPr>
         <w:t>- Explain one program behavior clearly.</w:t>
       </w:r>
     </w:p>

</xml_diff>